<commit_message>
docs(D2): versión 1.0 aprobada (tarea 3.8)
El equipo aprobó el D2 el 23-10-2026, junto con el plan de pruebas (puerta
de fase 3). El diseño no cambia respecto de la 0.9.1. Esta versión:

- Fecha la versión 1.0 y completa la tabla de aprobación. La aprobación la
  registra el jefe de proyecto.
- Toma como entrada el SRS v1.0.
- Deja los puntos abiertos de §9 para la construcción.

Co-Authored-By: Claude Opus 5.5 <noreply@anthropic.com>
</commit_message>
<xml_diff>
--- a/Fase 2/Evidencias Grupales/D2_Diseno_CascoVision.docx
+++ b/Fase 2/Evidencias Grupales/D2_Diseno_CascoVision.docx
@@ -31,7 +31,7 @@
         <w:pStyle w:val="Fecha"/>
       </w:pPr>
       <w:r>
-        <w:t>Capstone PTY4614 · 2026.02 · Versión 0.9.1 (lista para aprobación) · 23-10-2026</w:t>
+        <w:t>Capstone PTY4614 · 2026.02 · Versión 1.0 (aprobada) · 23-10-2026</w:t>
       </w:r>
     </w:p>
     <w:sdt>
@@ -42,7 +42,7 @@
           <w:sz w:val="24"/>
           <w:szCs w:val="24"/>
         </w:rPr>
-        <w:id w:val="1610092276"/>
+        <w:id w:val="-1281723613"/>
         <w:docPartObj>
           <w:docPartGallery w:val="Table of Contents"/>
           <w:docPartUnique/>
@@ -81,7 +81,7 @@
           <w:r>
             <w:fldChar w:fldCharType="separate"/>
           </w:r>
-          <w:hyperlink w:anchor="_Toc243608448" w:history="1">
+          <w:hyperlink w:anchor="_Toc243611166" w:history="1">
             <w:r>
               <w:rPr>
                 <w:rStyle w:val="Hipervnculo"/>
@@ -108,7 +108,7 @@
                 <w:noProof/>
                 <w:webHidden/>
               </w:rPr>
-              <w:instrText xml:space="preserve"> PAGEREF _Toc243608448 \h </w:instrText>
+              <w:instrText xml:space="preserve"> PAGEREF _Toc243611166 \h </w:instrText>
             </w:r>
             <w:r>
               <w:rPr>
@@ -153,7 +153,7 @@
               <w14:ligatures w14:val="standardContextual"/>
             </w:rPr>
           </w:pPr>
-          <w:hyperlink w:anchor="_Toc243608449" w:history="1">
+          <w:hyperlink w:anchor="_Toc243611167" w:history="1">
             <w:r>
               <w:rPr>
                 <w:rStyle w:val="Hipervnculo"/>
@@ -180,7 +180,7 @@
                 <w:noProof/>
                 <w:webHidden/>
               </w:rPr>
-              <w:instrText xml:space="preserve"> PAGEREF _Toc243608449 \h </w:instrText>
+              <w:instrText xml:space="preserve"> PAGEREF _Toc243611167 \h </w:instrText>
             </w:r>
             <w:r>
               <w:rPr>
@@ -200,7 +200,7 @@
                 <w:noProof/>
                 <w:webHidden/>
               </w:rPr>
-              <w:t>2</w:t>
+              <w:t>3</w:t>
             </w:r>
             <w:r>
               <w:rPr>
@@ -225,7 +225,7 @@
               <w14:ligatures w14:val="standardContextual"/>
             </w:rPr>
           </w:pPr>
-          <w:hyperlink w:anchor="_Toc243608450" w:history="1">
+          <w:hyperlink w:anchor="_Toc243611168" w:history="1">
             <w:r>
               <w:rPr>
                 <w:rStyle w:val="Hipervnculo"/>
@@ -252,7 +252,7 @@
                 <w:noProof/>
                 <w:webHidden/>
               </w:rPr>
-              <w:instrText xml:space="preserve"> PAGEREF _Toc243608450 \h </w:instrText>
+              <w:instrText xml:space="preserve"> PAGEREF _Toc243611168 \h </w:instrText>
             </w:r>
             <w:r>
               <w:rPr>
@@ -272,7 +272,7 @@
                 <w:noProof/>
                 <w:webHidden/>
               </w:rPr>
-              <w:t>2</w:t>
+              <w:t>3</w:t>
             </w:r>
             <w:r>
               <w:rPr>
@@ -297,7 +297,7 @@
               <w14:ligatures w14:val="standardContextual"/>
             </w:rPr>
           </w:pPr>
-          <w:hyperlink w:anchor="_Toc243608451" w:history="1">
+          <w:hyperlink w:anchor="_Toc243611169" w:history="1">
             <w:r>
               <w:rPr>
                 <w:rStyle w:val="Hipervnculo"/>
@@ -324,7 +324,7 @@
                 <w:noProof/>
                 <w:webHidden/>
               </w:rPr>
-              <w:instrText xml:space="preserve"> PAGEREF _Toc243608451 \h </w:instrText>
+              <w:instrText xml:space="preserve"> PAGEREF _Toc243611169 \h </w:instrText>
             </w:r>
             <w:r>
               <w:rPr>
@@ -369,7 +369,7 @@
               <w14:ligatures w14:val="standardContextual"/>
             </w:rPr>
           </w:pPr>
-          <w:hyperlink w:anchor="_Toc243608452" w:history="1">
+          <w:hyperlink w:anchor="_Toc243611170" w:history="1">
             <w:r>
               <w:rPr>
                 <w:rStyle w:val="Hipervnculo"/>
@@ -396,7 +396,7 @@
                 <w:noProof/>
                 <w:webHidden/>
               </w:rPr>
-              <w:instrText xml:space="preserve"> PAGEREF _Toc243608452 \h </w:instrText>
+              <w:instrText xml:space="preserve"> PAGEREF _Toc243611170 \h </w:instrText>
             </w:r>
             <w:r>
               <w:rPr>
@@ -416,7 +416,7 @@
                 <w:noProof/>
                 <w:webHidden/>
               </w:rPr>
-              <w:t>3</w:t>
+              <w:t>4</w:t>
             </w:r>
             <w:r>
               <w:rPr>
@@ -441,7 +441,7 @@
               <w14:ligatures w14:val="standardContextual"/>
             </w:rPr>
           </w:pPr>
-          <w:hyperlink w:anchor="_Toc243608453" w:history="1">
+          <w:hyperlink w:anchor="_Toc243611171" w:history="1">
             <w:r>
               <w:rPr>
                 <w:rStyle w:val="Hipervnculo"/>
@@ -468,7 +468,7 @@
                 <w:noProof/>
                 <w:webHidden/>
               </w:rPr>
-              <w:instrText xml:space="preserve"> PAGEREF _Toc243608453 \h </w:instrText>
+              <w:instrText xml:space="preserve"> PAGEREF _Toc243611171 \h </w:instrText>
             </w:r>
             <w:r>
               <w:rPr>
@@ -513,7 +513,7 @@
               <w14:ligatures w14:val="standardContextual"/>
             </w:rPr>
           </w:pPr>
-          <w:hyperlink w:anchor="_Toc243608454" w:history="1">
+          <w:hyperlink w:anchor="_Toc243611172" w:history="1">
             <w:r>
               <w:rPr>
                 <w:rStyle w:val="Hipervnculo"/>
@@ -540,7 +540,7 @@
                 <w:noProof/>
                 <w:webHidden/>
               </w:rPr>
-              <w:instrText xml:space="preserve"> PAGEREF _Toc243608454 \h </w:instrText>
+              <w:instrText xml:space="preserve"> PAGEREF _Toc243611172 \h </w:instrText>
             </w:r>
             <w:r>
               <w:rPr>
@@ -560,7 +560,7 @@
                 <w:noProof/>
                 <w:webHidden/>
               </w:rPr>
-              <w:t>4</w:t>
+              <w:t>5</w:t>
             </w:r>
             <w:r>
               <w:rPr>
@@ -585,7 +585,7 @@
               <w14:ligatures w14:val="standardContextual"/>
             </w:rPr>
           </w:pPr>
-          <w:hyperlink w:anchor="_Toc243608455" w:history="1">
+          <w:hyperlink w:anchor="_Toc243611173" w:history="1">
             <w:r>
               <w:rPr>
                 <w:rStyle w:val="Hipervnculo"/>
@@ -612,7 +612,7 @@
                 <w:noProof/>
                 <w:webHidden/>
               </w:rPr>
-              <w:instrText xml:space="preserve"> PAGEREF _Toc243608455 \h </w:instrText>
+              <w:instrText xml:space="preserve"> PAGEREF _Toc243611173 \h </w:instrText>
             </w:r>
             <w:r>
               <w:rPr>
@@ -632,7 +632,7 @@
                 <w:noProof/>
                 <w:webHidden/>
               </w:rPr>
-              <w:t>4</w:t>
+              <w:t>5</w:t>
             </w:r>
             <w:r>
               <w:rPr>
@@ -657,7 +657,7 @@
               <w14:ligatures w14:val="standardContextual"/>
             </w:rPr>
           </w:pPr>
-          <w:hyperlink w:anchor="_Toc243608456" w:history="1">
+          <w:hyperlink w:anchor="_Toc243611174" w:history="1">
             <w:r>
               <w:rPr>
                 <w:rStyle w:val="Hipervnculo"/>
@@ -684,7 +684,7 @@
                 <w:noProof/>
                 <w:webHidden/>
               </w:rPr>
-              <w:instrText xml:space="preserve"> PAGEREF _Toc243608456 \h </w:instrText>
+              <w:instrText xml:space="preserve"> PAGEREF _Toc243611174 \h </w:instrText>
             </w:r>
             <w:r>
               <w:rPr>
@@ -704,7 +704,7 @@
                 <w:noProof/>
                 <w:webHidden/>
               </w:rPr>
-              <w:t>5</w:t>
+              <w:t>6</w:t>
             </w:r>
             <w:r>
               <w:rPr>
@@ -729,7 +729,7 @@
               <w14:ligatures w14:val="standardContextual"/>
             </w:rPr>
           </w:pPr>
-          <w:hyperlink w:anchor="_Toc243608457" w:history="1">
+          <w:hyperlink w:anchor="_Toc243611175" w:history="1">
             <w:r>
               <w:rPr>
                 <w:rStyle w:val="Hipervnculo"/>
@@ -756,7 +756,7 @@
                 <w:noProof/>
                 <w:webHidden/>
               </w:rPr>
-              <w:instrText xml:space="preserve"> PAGEREF _Toc243608457 \h </w:instrText>
+              <w:instrText xml:space="preserve"> PAGEREF _Toc243611175 \h </w:instrText>
             </w:r>
             <w:r>
               <w:rPr>
@@ -801,7 +801,7 @@
               <w14:ligatures w14:val="standardContextual"/>
             </w:rPr>
           </w:pPr>
-          <w:hyperlink w:anchor="_Toc243608458" w:history="1">
+          <w:hyperlink w:anchor="_Toc243611176" w:history="1">
             <w:r>
               <w:rPr>
                 <w:rStyle w:val="Hipervnculo"/>
@@ -828,7 +828,7 @@
                 <w:noProof/>
                 <w:webHidden/>
               </w:rPr>
-              <w:instrText xml:space="preserve"> PAGEREF _Toc243608458 \h </w:instrText>
+              <w:instrText xml:space="preserve"> PAGEREF _Toc243611176 \h </w:instrText>
             </w:r>
             <w:r>
               <w:rPr>
@@ -873,7 +873,7 @@
               <w14:ligatures w14:val="standardContextual"/>
             </w:rPr>
           </w:pPr>
-          <w:hyperlink w:anchor="_Toc243608459" w:history="1">
+          <w:hyperlink w:anchor="_Toc243611177" w:history="1">
             <w:r>
               <w:rPr>
                 <w:rStyle w:val="Hipervnculo"/>
@@ -900,7 +900,7 @@
                 <w:noProof/>
                 <w:webHidden/>
               </w:rPr>
-              <w:instrText xml:space="preserve"> PAGEREF _Toc243608459 \h </w:instrText>
+              <w:instrText xml:space="preserve"> PAGEREF _Toc243611177 \h </w:instrText>
             </w:r>
             <w:r>
               <w:rPr>
@@ -920,7 +920,7 @@
                 <w:noProof/>
                 <w:webHidden/>
               </w:rPr>
-              <w:t>6</w:t>
+              <w:t>7</w:t>
             </w:r>
             <w:r>
               <w:rPr>
@@ -945,7 +945,7 @@
               <w14:ligatures w14:val="standardContextual"/>
             </w:rPr>
           </w:pPr>
-          <w:hyperlink w:anchor="_Toc243608460" w:history="1">
+          <w:hyperlink w:anchor="_Toc243611178" w:history="1">
             <w:r>
               <w:rPr>
                 <w:rStyle w:val="Hipervnculo"/>
@@ -972,7 +972,7 @@
                 <w:noProof/>
                 <w:webHidden/>
               </w:rPr>
-              <w:instrText xml:space="preserve"> PAGEREF _Toc243608460 \h </w:instrText>
+              <w:instrText xml:space="preserve"> PAGEREF _Toc243611178 \h </w:instrText>
             </w:r>
             <w:r>
               <w:rPr>
@@ -1017,7 +1017,7 @@
               <w14:ligatures w14:val="standardContextual"/>
             </w:rPr>
           </w:pPr>
-          <w:hyperlink w:anchor="_Toc243608461" w:history="1">
+          <w:hyperlink w:anchor="_Toc243611179" w:history="1">
             <w:r>
               <w:rPr>
                 <w:rStyle w:val="Hipervnculo"/>
@@ -1044,7 +1044,7 @@
                 <w:noProof/>
                 <w:webHidden/>
               </w:rPr>
-              <w:instrText xml:space="preserve"> PAGEREF _Toc243608461 \h </w:instrText>
+              <w:instrText xml:space="preserve"> PAGEREF _Toc243611179 \h </w:instrText>
             </w:r>
             <w:r>
               <w:rPr>
@@ -1089,7 +1089,7 @@
               <w14:ligatures w14:val="standardContextual"/>
             </w:rPr>
           </w:pPr>
-          <w:hyperlink w:anchor="_Toc243608462" w:history="1">
+          <w:hyperlink w:anchor="_Toc243611180" w:history="1">
             <w:r>
               <w:rPr>
                 <w:rStyle w:val="Hipervnculo"/>
@@ -1116,7 +1116,7 @@
                 <w:noProof/>
                 <w:webHidden/>
               </w:rPr>
-              <w:instrText xml:space="preserve"> PAGEREF _Toc243608462 \h </w:instrText>
+              <w:instrText xml:space="preserve"> PAGEREF _Toc243611180 \h </w:instrText>
             </w:r>
             <w:r>
               <w:rPr>
@@ -1161,7 +1161,7 @@
               <w14:ligatures w14:val="standardContextual"/>
             </w:rPr>
           </w:pPr>
-          <w:hyperlink w:anchor="_Toc243608463" w:history="1">
+          <w:hyperlink w:anchor="_Toc243611181" w:history="1">
             <w:r>
               <w:rPr>
                 <w:rStyle w:val="Hipervnculo"/>
@@ -1188,7 +1188,7 @@
                 <w:noProof/>
                 <w:webHidden/>
               </w:rPr>
-              <w:instrText xml:space="preserve"> PAGEREF _Toc243608463 \h </w:instrText>
+              <w:instrText xml:space="preserve"> PAGEREF _Toc243611181 \h </w:instrText>
             </w:r>
             <w:r>
               <w:rPr>
@@ -1233,7 +1233,7 @@
               <w14:ligatures w14:val="standardContextual"/>
             </w:rPr>
           </w:pPr>
-          <w:hyperlink w:anchor="_Toc243608464" w:history="1">
+          <w:hyperlink w:anchor="_Toc243611182" w:history="1">
             <w:r>
               <w:rPr>
                 <w:rStyle w:val="Hipervnculo"/>
@@ -1260,7 +1260,7 @@
                 <w:noProof/>
                 <w:webHidden/>
               </w:rPr>
-              <w:instrText xml:space="preserve"> PAGEREF _Toc243608464 \h </w:instrText>
+              <w:instrText xml:space="preserve"> PAGEREF _Toc243611182 \h </w:instrText>
             </w:r>
             <w:r>
               <w:rPr>
@@ -1305,7 +1305,7 @@
               <w14:ligatures w14:val="standardContextual"/>
             </w:rPr>
           </w:pPr>
-          <w:hyperlink w:anchor="_Toc243608465" w:history="1">
+          <w:hyperlink w:anchor="_Toc243611183" w:history="1">
             <w:r>
               <w:rPr>
                 <w:rStyle w:val="Hipervnculo"/>
@@ -1332,7 +1332,7 @@
                 <w:noProof/>
                 <w:webHidden/>
               </w:rPr>
-              <w:instrText xml:space="preserve"> PAGEREF _Toc243608465 \h </w:instrText>
+              <w:instrText xml:space="preserve"> PAGEREF _Toc243611183 \h </w:instrText>
             </w:r>
             <w:r>
               <w:rPr>
@@ -1377,7 +1377,7 @@
               <w14:ligatures w14:val="standardContextual"/>
             </w:rPr>
           </w:pPr>
-          <w:hyperlink w:anchor="_Toc243608466" w:history="1">
+          <w:hyperlink w:anchor="_Toc243611184" w:history="1">
             <w:r>
               <w:rPr>
                 <w:rStyle w:val="Hipervnculo"/>
@@ -1404,7 +1404,7 @@
                 <w:noProof/>
                 <w:webHidden/>
               </w:rPr>
-              <w:instrText xml:space="preserve"> PAGEREF _Toc243608466 \h </w:instrText>
+              <w:instrText xml:space="preserve"> PAGEREF _Toc243611184 \h </w:instrText>
             </w:r>
             <w:r>
               <w:rPr>
@@ -1449,7 +1449,7 @@
               <w14:ligatures w14:val="standardContextual"/>
             </w:rPr>
           </w:pPr>
-          <w:hyperlink w:anchor="_Toc243608467" w:history="1">
+          <w:hyperlink w:anchor="_Toc243611185" w:history="1">
             <w:r>
               <w:rPr>
                 <w:rStyle w:val="Hipervnculo"/>
@@ -1476,7 +1476,7 @@
                 <w:noProof/>
                 <w:webHidden/>
               </w:rPr>
-              <w:instrText xml:space="preserve"> PAGEREF _Toc243608467 \h </w:instrText>
+              <w:instrText xml:space="preserve"> PAGEREF _Toc243611185 \h </w:instrText>
             </w:r>
             <w:r>
               <w:rPr>
@@ -1521,7 +1521,7 @@
               <w14:ligatures w14:val="standardContextual"/>
             </w:rPr>
           </w:pPr>
-          <w:hyperlink w:anchor="_Toc243608468" w:history="1">
+          <w:hyperlink w:anchor="_Toc243611186" w:history="1">
             <w:r>
               <w:rPr>
                 <w:rStyle w:val="Hipervnculo"/>
@@ -1548,7 +1548,7 @@
                 <w:noProof/>
                 <w:webHidden/>
               </w:rPr>
-              <w:instrText xml:space="preserve"> PAGEREF _Toc243608468 \h </w:instrText>
+              <w:instrText xml:space="preserve"> PAGEREF _Toc243611186 \h </w:instrText>
             </w:r>
             <w:r>
               <w:rPr>
@@ -1593,7 +1593,7 @@
               <w14:ligatures w14:val="standardContextual"/>
             </w:rPr>
           </w:pPr>
-          <w:hyperlink w:anchor="_Toc243608469" w:history="1">
+          <w:hyperlink w:anchor="_Toc243611187" w:history="1">
             <w:r>
               <w:rPr>
                 <w:rStyle w:val="Hipervnculo"/>
@@ -1620,7 +1620,7 @@
                 <w:noProof/>
                 <w:webHidden/>
               </w:rPr>
-              <w:instrText xml:space="preserve"> PAGEREF _Toc243608469 \h </w:instrText>
+              <w:instrText xml:space="preserve"> PAGEREF _Toc243611187 \h </w:instrText>
             </w:r>
             <w:r>
               <w:rPr>
@@ -1665,7 +1665,7 @@
               <w14:ligatures w14:val="standardContextual"/>
             </w:rPr>
           </w:pPr>
-          <w:hyperlink w:anchor="_Toc243608470" w:history="1">
+          <w:hyperlink w:anchor="_Toc243611188" w:history="1">
             <w:r>
               <w:rPr>
                 <w:rStyle w:val="Hipervnculo"/>
@@ -1701,7 +1701,7 @@
                 <w:noProof/>
                 <w:webHidden/>
               </w:rPr>
-              <w:instrText xml:space="preserve"> PAGEREF _Toc243608470 \h </w:instrText>
+              <w:instrText xml:space="preserve"> PAGEREF _Toc243611188 \h </w:instrText>
             </w:r>
             <w:r>
               <w:rPr>
@@ -1746,7 +1746,7 @@
               <w14:ligatures w14:val="standardContextual"/>
             </w:rPr>
           </w:pPr>
-          <w:hyperlink w:anchor="_Toc243608471" w:history="1">
+          <w:hyperlink w:anchor="_Toc243611189" w:history="1">
             <w:r>
               <w:rPr>
                 <w:rStyle w:val="Hipervnculo"/>
@@ -1773,7 +1773,7 @@
                 <w:noProof/>
                 <w:webHidden/>
               </w:rPr>
-              <w:instrText xml:space="preserve"> PAGEREF _Toc243608471 \h </w:instrText>
+              <w:instrText xml:space="preserve"> PAGEREF _Toc243611189 \h </w:instrText>
             </w:r>
             <w:r>
               <w:rPr>
@@ -1818,7 +1818,7 @@
               <w14:ligatures w14:val="standardContextual"/>
             </w:rPr>
           </w:pPr>
-          <w:hyperlink w:anchor="_Toc243608472" w:history="1">
+          <w:hyperlink w:anchor="_Toc243611190" w:history="1">
             <w:r>
               <w:rPr>
                 <w:rStyle w:val="Hipervnculo"/>
@@ -1845,7 +1845,7 @@
                 <w:noProof/>
                 <w:webHidden/>
               </w:rPr>
-              <w:instrText xml:space="preserve"> PAGEREF _Toc243608472 \h </w:instrText>
+              <w:instrText xml:space="preserve"> PAGEREF _Toc243611190 \h </w:instrText>
             </w:r>
             <w:r>
               <w:rPr>
@@ -1890,7 +1890,7 @@
               <w14:ligatures w14:val="standardContextual"/>
             </w:rPr>
           </w:pPr>
-          <w:hyperlink w:anchor="_Toc243608473" w:history="1">
+          <w:hyperlink w:anchor="_Toc243611191" w:history="1">
             <w:r>
               <w:rPr>
                 <w:rStyle w:val="Hipervnculo"/>
@@ -1917,7 +1917,7 @@
                 <w:noProof/>
                 <w:webHidden/>
               </w:rPr>
-              <w:instrText xml:space="preserve"> PAGEREF _Toc243608473 \h </w:instrText>
+              <w:instrText xml:space="preserve"> PAGEREF _Toc243611191 \h </w:instrText>
             </w:r>
             <w:r>
               <w:rPr>
@@ -1962,7 +1962,7 @@
               <w14:ligatures w14:val="standardContextual"/>
             </w:rPr>
           </w:pPr>
-          <w:hyperlink w:anchor="_Toc243608474" w:history="1">
+          <w:hyperlink w:anchor="_Toc243611192" w:history="1">
             <w:r>
               <w:rPr>
                 <w:rStyle w:val="Hipervnculo"/>
@@ -1989,7 +1989,7 @@
                 <w:noProof/>
                 <w:webHidden/>
               </w:rPr>
-              <w:instrText xml:space="preserve"> PAGEREF _Toc243608474 \h </w:instrText>
+              <w:instrText xml:space="preserve"> PAGEREF _Toc243611192 \h </w:instrText>
             </w:r>
             <w:r>
               <w:rPr>
@@ -2034,7 +2034,7 @@
               <w14:ligatures w14:val="standardContextual"/>
             </w:rPr>
           </w:pPr>
-          <w:hyperlink w:anchor="_Toc243608475" w:history="1">
+          <w:hyperlink w:anchor="_Toc243611193" w:history="1">
             <w:r>
               <w:rPr>
                 <w:rStyle w:val="Hipervnculo"/>
@@ -2061,7 +2061,7 @@
                 <w:noProof/>
                 <w:webHidden/>
               </w:rPr>
-              <w:instrText xml:space="preserve"> PAGEREF _Toc243608475 \h </w:instrText>
+              <w:instrText xml:space="preserve"> PAGEREF _Toc243611193 \h </w:instrText>
             </w:r>
             <w:r>
               <w:rPr>
@@ -2104,7 +2104,7 @@
         <w:pStyle w:val="Ttulo1"/>
       </w:pPr>
       <w:bookmarkStart w:id="0" w:name="control-del-documento"/>
-      <w:bookmarkStart w:id="1" w:name="_Toc243608448"/>
+      <w:bookmarkStart w:id="1" w:name="_Toc243611166"/>
       <w:r>
         <w:t>Control del documento</w:t>
       </w:r>
@@ -2438,11 +2438,7 @@
               <w:pStyle w:val="Compact"/>
             </w:pPr>
             <w:r>
-              <w:rPr>
-                <w:i/>
-                <w:iCs/>
-              </w:rPr>
-              <w:t>pendiente</w:t>
+              <w:t>23-10-2026</w:t>
             </w:r>
           </w:p>
         </w:tc>
@@ -2468,7 +2464,7 @@
               <w:pStyle w:val="Compact"/>
             </w:pPr>
             <w:r>
-              <w:t>Versión aprobada (puerta de fase 3 · Diseño)</w:t>
+              <w:t>Versión aprobada (puerta de fase 3 · Diseño), sin cambios de diseño respecto de la 0.9.1. Aprobación registrada por Iahn Vera (jefe de proyecto) el 23-10-2026.</w:t>
             </w:r>
           </w:p>
         </w:tc>
@@ -2496,7 +2492,7 @@
         <w:t>fase 3 (Diseño)</w:t>
       </w:r>
       <w:r>
-        <w:t>. Su entrada es el SRS v0.4 (D1) y su salida alimenta la construcción (fase 4) y el plan de pruebas (D3).</w:t>
+        <w:t>. Su entrada es el SRS v1.0 (D1) y su salida alimenta la construcción (fase 4) y el plan de pruebas (D3).</w:t>
       </w:r>
     </w:p>
     <w:p>
@@ -2966,9 +2962,10 @@
         <w:pStyle w:val="Ttulo1"/>
       </w:pPr>
       <w:bookmarkStart w:id="2" w:name="introducción"/>
-      <w:bookmarkStart w:id="3" w:name="_Toc243608449"/>
+      <w:bookmarkStart w:id="3" w:name="_Toc243611167"/>
       <w:bookmarkEnd w:id="0"/>
       <w:r>
+        <w:lastRenderedPageBreak/>
         <w:t>1. Introducción</w:t>
       </w:r>
       <w:bookmarkEnd w:id="3"/>
@@ -2978,7 +2975,7 @@
         <w:pStyle w:val="Ttulo2"/>
       </w:pPr>
       <w:bookmarkStart w:id="4" w:name="propósito"/>
-      <w:bookmarkStart w:id="5" w:name="_Toc243608450"/>
+      <w:bookmarkStart w:id="5" w:name="_Toc243611168"/>
       <w:r>
         <w:t>1.1 Propósito</w:t>
       </w:r>
@@ -2999,11 +2996,7 @@
         <w:t>cómo se construye CascoVision</w:t>
       </w:r>
       <w:r>
-        <w:t xml:space="preserve">: su arquitectura, cómo se despliega, qué datos guarda, cómo se comportan sus clases y componentes, </w:t>
-      </w:r>
-      <w:r>
-        <w:lastRenderedPageBreak/>
-        <w:t>cómo se comunica con la baliza y cómo se ve su interfaz. Todo requisito del SRS se asigna aquí a un componente (§8), y cada componente tiene casos de prueba en el D3.</w:t>
+        <w:t>: su arquitectura, cómo se despliega, qué datos guarda, cómo se comportan sus clases y componentes, cómo se comunica con la baliza y cómo se ve su interfaz. Todo requisito del SRS se asigna aquí a un componente (§8), y cada componente tiene casos de prueba en el D3.</w:t>
       </w:r>
     </w:p>
     <w:p>
@@ -3011,7 +3004,7 @@
         <w:pStyle w:val="Ttulo2"/>
       </w:pPr>
       <w:bookmarkStart w:id="6" w:name="resumen-de-la-solución"/>
-      <w:bookmarkStart w:id="7" w:name="_Toc243608451"/>
+      <w:bookmarkStart w:id="7" w:name="_Toc243611169"/>
       <w:bookmarkEnd w:id="4"/>
       <w:r>
         <w:t>1.2 Resumen de la solución</w:t>
@@ -3131,10 +3124,11 @@
         <w:pStyle w:val="Ttulo1"/>
       </w:pPr>
       <w:bookmarkStart w:id="8" w:name="arquitectura"/>
-      <w:bookmarkStart w:id="9" w:name="_Toc243608452"/>
+      <w:bookmarkStart w:id="9" w:name="_Toc243611170"/>
       <w:bookmarkEnd w:id="2"/>
       <w:bookmarkEnd w:id="6"/>
       <w:r>
+        <w:lastRenderedPageBreak/>
         <w:t>2. Arquitectura</w:t>
       </w:r>
       <w:bookmarkEnd w:id="9"/>
@@ -3148,7 +3142,7 @@
           <w:noProof/>
         </w:rPr>
         <w:drawing>
-          <wp:inline distT="0" distB="0" distL="0" distR="0" wp14:anchorId="25C57F23" wp14:editId="24AB3590">
+          <wp:inline distT="0" distB="0" distL="0" distR="0" wp14:anchorId="0F3F06B0" wp14:editId="7FF0593D">
             <wp:extent cx="5600700" cy="4348043"/>
             <wp:effectExtent l="0" t="0" r="0" b="0"/>
             <wp:docPr id="27" name="Picture" descr="Figura 1. Arquitectura lógica de CascoVision. La línea roja es la ruta crítica de la alerta."/>
@@ -3203,9 +3197,8 @@
         <w:pStyle w:val="Ttulo2"/>
       </w:pPr>
       <w:bookmarkStart w:id="10" w:name="decisiones-de-arquitectura"/>
-      <w:bookmarkStart w:id="11" w:name="_Toc243608453"/>
-      <w:r>
-        <w:lastRenderedPageBreak/>
+      <w:bookmarkStart w:id="11" w:name="_Toc243611171"/>
+      <w:r>
         <w:t>2.1 Decisiones de arquitectura</w:t>
       </w:r>
       <w:bookmarkEnd w:id="11"/>
@@ -3574,7 +3567,11 @@
               <w:pStyle w:val="Compact"/>
             </w:pPr>
             <w:r>
-              <w:t>Evidencia en un volumen del servidor; la base de datos guarda la ruta y la API la entrega con JWT</w:t>
+              <w:t xml:space="preserve">Evidencia en un volumen del </w:t>
+            </w:r>
+            <w:r>
+              <w:lastRenderedPageBreak/>
+              <w:t>servidor; la base de datos guarda la ruta y la API la entrega con JWT</w:t>
             </w:r>
           </w:p>
         </w:tc>
@@ -3587,7 +3584,12 @@
               <w:pStyle w:val="Compact"/>
             </w:pPr>
             <w:r>
-              <w:t>Sin imágenes en la base de datos ni rutas expuestas</w:t>
+              <w:lastRenderedPageBreak/>
+              <w:t xml:space="preserve">Sin imágenes en la base de </w:t>
+            </w:r>
+            <w:r>
+              <w:lastRenderedPageBreak/>
+              <w:t>datos ni rutas expuestas</w:t>
             </w:r>
           </w:p>
         </w:tc>
@@ -3600,6 +3602,7 @@
               <w:pStyle w:val="Compact"/>
             </w:pPr>
             <w:r>
+              <w:lastRenderedPageBreak/>
               <w:t>RF-05, RF-19</w:t>
             </w:r>
           </w:p>
@@ -3833,7 +3836,7 @@
         <w:pStyle w:val="Ttulo2"/>
       </w:pPr>
       <w:bookmarkStart w:id="12" w:name="componentes"/>
-      <w:bookmarkStart w:id="13" w:name="_Toc243608454"/>
+      <w:bookmarkStart w:id="13" w:name="_Toc243611172"/>
       <w:bookmarkEnd w:id="10"/>
       <w:r>
         <w:t>2.2 Componentes</w:t>
@@ -4156,7 +4159,7 @@
         <w:pStyle w:val="Ttulo2"/>
       </w:pPr>
       <w:bookmarkStart w:id="14" w:name="comunicación-entre-servicios"/>
-      <w:bookmarkStart w:id="15" w:name="_Toc243608455"/>
+      <w:bookmarkStart w:id="15" w:name="_Toc243611173"/>
       <w:bookmarkEnd w:id="12"/>
       <w:r>
         <w:t>2.3 Comunicación entre servicios</w:t>
@@ -4258,7 +4261,6 @@
               <w:pStyle w:val="Compact"/>
             </w:pPr>
             <w:r>
-              <w:lastRenderedPageBreak/>
               <w:t>I-01</w:t>
             </w:r>
           </w:p>
@@ -4876,7 +4878,11 @@
               <w:pStyle w:val="Compact"/>
             </w:pPr>
             <w:r>
-              <w:t>Credenciales de Twilio</w:t>
+              <w:t xml:space="preserve">Credenciales de </w:t>
+            </w:r>
+            <w:r>
+              <w:lastRenderedPageBreak/>
+              <w:t>Twilio</w:t>
             </w:r>
           </w:p>
         </w:tc>
@@ -4889,6 +4895,7 @@
               <w:pStyle w:val="Compact"/>
             </w:pPr>
             <w:r>
+              <w:lastRenderedPageBreak/>
               <w:t>≤ 30 s</w:t>
             </w:r>
           </w:p>
@@ -4967,7 +4974,7 @@
         <w:pStyle w:val="Ttulo2"/>
       </w:pPr>
       <w:bookmarkStart w:id="16" w:name="Xcb91fe2dc8b800d09a5b566d1cb325069ce961d"/>
-      <w:bookmarkStart w:id="17" w:name="_Toc243608456"/>
+      <w:bookmarkStart w:id="17" w:name="_Toc243611174"/>
       <w:bookmarkEnd w:id="14"/>
       <w:r>
         <w:t>2.4 Presupuesto de latencia de la alerta (RNF-02)</w:t>
@@ -5171,11 +5178,10 @@
         <w:pStyle w:val="Ttulo1"/>
       </w:pPr>
       <w:bookmarkStart w:id="18" w:name="despliegue"/>
-      <w:bookmarkStart w:id="19" w:name="_Toc243608457"/>
+      <w:bookmarkStart w:id="19" w:name="_Toc243611175"/>
       <w:bookmarkEnd w:id="8"/>
       <w:bookmarkEnd w:id="16"/>
       <w:r>
-        <w:lastRenderedPageBreak/>
         <w:t>3. Despliegue</w:t>
       </w:r>
       <w:bookmarkEnd w:id="19"/>
@@ -5189,7 +5195,7 @@
           <w:noProof/>
         </w:rPr>
         <w:drawing>
-          <wp:inline distT="0" distB="0" distL="0" distR="0" wp14:anchorId="5732929A" wp14:editId="4A2F0E1D">
+          <wp:inline distT="0" distB="0" distL="0" distR="0" wp14:anchorId="429C680E" wp14:editId="0550B456">
             <wp:extent cx="5600700" cy="4348043"/>
             <wp:effectExtent l="0" t="0" r="0" b="0"/>
             <wp:docPr id="35" name="Picture" descr="Figura 2. Diagrama de despliegue UML de CascoVision en la red de la faena."/>
@@ -5244,7 +5250,7 @@
         <w:pStyle w:val="Ttulo2"/>
       </w:pPr>
       <w:bookmarkStart w:id="20" w:name="nodos"/>
-      <w:bookmarkStart w:id="21" w:name="_Toc243608458"/>
+      <w:bookmarkStart w:id="21" w:name="_Toc243611176"/>
       <w:r>
         <w:t>3.1 Nodos</w:t>
       </w:r>
@@ -5330,7 +5336,11 @@
               <w:pStyle w:val="Compact"/>
             </w:pPr>
             <w:r>
-              <w:t>Mínimo propuesto: CPU de 4 núcleos, 16 GB de RAM, SSD de 256 GB; Ubuntu 24.04 o Windows 11 con Docker</w:t>
+              <w:t xml:space="preserve">Mínimo propuesto: CPU de 4 núcleos, 16 GB de RAM, SSD de 256 GB; Ubuntu </w:t>
+            </w:r>
+            <w:r>
+              <w:lastRenderedPageBreak/>
+              <w:t>24.04 o Windows 11 con Docker</w:t>
             </w:r>
           </w:p>
         </w:tc>
@@ -5343,7 +5353,12 @@
               <w:pStyle w:val="Compact"/>
             </w:pPr>
             <w:r>
-              <w:t>Los 4 contenedores y sus volúmenes</w:t>
+              <w:lastRenderedPageBreak/>
+              <w:t xml:space="preserve">Los 4 contenedores y sus </w:t>
+            </w:r>
+            <w:r>
+              <w:lastRenderedPageBreak/>
+              <w:t>volúmenes</w:t>
             </w:r>
           </w:p>
         </w:tc>
@@ -5358,6 +5373,7 @@
               <w:pStyle w:val="Compact"/>
             </w:pPr>
             <w:r>
+              <w:lastRenderedPageBreak/>
               <w:t>Cámara IP</w:t>
             </w:r>
           </w:p>
@@ -5518,7 +5534,7 @@
         <w:pStyle w:val="Ttulo2"/>
       </w:pPr>
       <w:bookmarkStart w:id="22" w:name="zonas-de-confianza"/>
-      <w:bookmarkStart w:id="23" w:name="_Toc243608459"/>
+      <w:bookmarkStart w:id="23" w:name="_Toc243611177"/>
       <w:bookmarkEnd w:id="20"/>
       <w:r>
         <w:t>3.2 Zonas de confianza</w:t>
@@ -5530,11 +5546,7 @@
         <w:pStyle w:val="FirstParagraph"/>
       </w:pPr>
       <w:r>
-        <w:t xml:space="preserve">Desde Internet no se abre ningún puerto hacia la faena; solo la API sale a Twilio y SMTP. En la LAN solo se publica el puerto 443 del servidor. Las balizas y las </w:t>
-      </w:r>
-      <w:r>
-        <w:lastRenderedPageBreak/>
-        <w:t>cámaras van en una red WiFi de dispositivos separada (WPA2), porque la orden a la baliza viaja por HTTP sin cifrar.</w:t>
+        <w:t>Desde Internet no se abre ningún puerto hacia la faena; solo la API sale a Twilio y SMTP. En la LAN solo se publica el puerto 443 del servidor. Las balizas y las cámaras van en una red WiFi de dispositivos separada (WPA2), porque la orden a la baliza viaja por HTTP sin cifrar.</w:t>
       </w:r>
     </w:p>
     <w:p>
@@ -5542,7 +5554,7 @@
         <w:pStyle w:val="Ttulo2"/>
       </w:pPr>
       <w:bookmarkStart w:id="24" w:name="diseño-docker"/>
-      <w:bookmarkStart w:id="25" w:name="_Toc243608460"/>
+      <w:bookmarkStart w:id="25" w:name="_Toc243611178"/>
       <w:bookmarkEnd w:id="22"/>
       <w:r>
         <w:t>3.3 Diseño Docker</w:t>
@@ -6046,7 +6058,7 @@
         <w:pStyle w:val="Compact"/>
         <w:numPr>
           <w:ilvl w:val="0"/>
-          <w:numId w:val="43"/>
+          <w:numId w:val="47"/>
         </w:numPr>
       </w:pPr>
       <w:r>
@@ -6101,7 +6113,7 @@
         <w:pStyle w:val="Compact"/>
         <w:numPr>
           <w:ilvl w:val="0"/>
-          <w:numId w:val="43"/>
+          <w:numId w:val="47"/>
         </w:numPr>
       </w:pPr>
       <w:r>
@@ -6156,7 +6168,7 @@
         <w:pStyle w:val="Compact"/>
         <w:numPr>
           <w:ilvl w:val="0"/>
-          <w:numId w:val="43"/>
+          <w:numId w:val="47"/>
         </w:numPr>
       </w:pPr>
       <w:r>
@@ -6202,7 +6214,7 @@
         <w:pStyle w:val="Compact"/>
         <w:numPr>
           <w:ilvl w:val="0"/>
-          <w:numId w:val="43"/>
+          <w:numId w:val="47"/>
         </w:numPr>
       </w:pPr>
       <w:r>
@@ -6293,7 +6305,7 @@
         <w:pStyle w:val="Compact"/>
         <w:numPr>
           <w:ilvl w:val="0"/>
-          <w:numId w:val="43"/>
+          <w:numId w:val="47"/>
         </w:numPr>
       </w:pPr>
       <w:r>
@@ -6330,7 +6342,7 @@
         <w:pStyle w:val="Ttulo1"/>
       </w:pPr>
       <w:bookmarkStart w:id="26" w:name="modelo-de-datos"/>
-      <w:bookmarkStart w:id="27" w:name="_Toc243608461"/>
+      <w:bookmarkStart w:id="27" w:name="_Toc243611179"/>
       <w:bookmarkEnd w:id="18"/>
       <w:bookmarkEnd w:id="24"/>
       <w:r>
@@ -6348,7 +6360,7 @@
           <w:noProof/>
         </w:rPr>
         <w:drawing>
-          <wp:inline distT="0" distB="0" distL="0" distR="0" wp14:anchorId="0A3D4528" wp14:editId="6B92C21B">
+          <wp:inline distT="0" distB="0" distL="0" distR="0" wp14:anchorId="0422F327" wp14:editId="4BD6E394">
             <wp:extent cx="5600700" cy="4348043"/>
             <wp:effectExtent l="0" t="0" r="0" b="0"/>
             <wp:docPr id="42" name="Picture" descr="Figura 3. Modelo entidad-relación (PostgreSQL)."/>
@@ -6403,7 +6415,7 @@
         <w:pStyle w:val="Ttulo2"/>
       </w:pPr>
       <w:bookmarkStart w:id="28" w:name="criterios"/>
-      <w:bookmarkStart w:id="29" w:name="_Toc243608462"/>
+      <w:bookmarkStart w:id="29" w:name="_Toc243611180"/>
       <w:r>
         <w:t>4.1 Criterios</w:t>
       </w:r>
@@ -6414,7 +6426,7 @@
         <w:pStyle w:val="Compact"/>
         <w:numPr>
           <w:ilvl w:val="0"/>
-          <w:numId w:val="44"/>
+          <w:numId w:val="48"/>
         </w:numPr>
       </w:pPr>
       <w:r>
@@ -6494,7 +6506,7 @@
         <w:pStyle w:val="Compact"/>
         <w:numPr>
           <w:ilvl w:val="0"/>
-          <w:numId w:val="44"/>
+          <w:numId w:val="48"/>
         </w:numPr>
       </w:pPr>
       <w:r>
@@ -6515,7 +6527,7 @@
         <w:pStyle w:val="Compact"/>
         <w:numPr>
           <w:ilvl w:val="0"/>
-          <w:numId w:val="44"/>
+          <w:numId w:val="48"/>
         </w:numPr>
       </w:pPr>
       <w:r>
@@ -6527,7 +6539,7 @@
         <w:pStyle w:val="Compact"/>
         <w:numPr>
           <w:ilvl w:val="0"/>
-          <w:numId w:val="44"/>
+          <w:numId w:val="48"/>
         </w:numPr>
       </w:pPr>
       <w:r>
@@ -6539,7 +6551,7 @@
         <w:pStyle w:val="Ttulo2"/>
       </w:pPr>
       <w:bookmarkStart w:id="30" w:name="tablas"/>
-      <w:bookmarkStart w:id="31" w:name="_Toc243608463"/>
+      <w:bookmarkStart w:id="31" w:name="_Toc243611181"/>
       <w:bookmarkEnd w:id="28"/>
       <w:r>
         <w:t>4.2 Tablas</w:t>
@@ -7464,7 +7476,7 @@
         <w:pStyle w:val="Ttulo1"/>
       </w:pPr>
       <w:bookmarkStart w:id="32" w:name="diagramas-uml"/>
-      <w:bookmarkStart w:id="33" w:name="_Toc243608464"/>
+      <w:bookmarkStart w:id="33" w:name="_Toc243611182"/>
       <w:bookmarkEnd w:id="26"/>
       <w:bookmarkEnd w:id="30"/>
       <w:r>
@@ -7478,7 +7490,7 @@
         <w:pStyle w:val="Ttulo2"/>
       </w:pPr>
       <w:bookmarkStart w:id="34" w:name="clases"/>
-      <w:bookmarkStart w:id="35" w:name="_Toc243608465"/>
+      <w:bookmarkStart w:id="35" w:name="_Toc243611183"/>
       <w:r>
         <w:t>5.1 Clases</w:t>
       </w:r>
@@ -7493,7 +7505,7 @@
           <w:noProof/>
         </w:rPr>
         <w:drawing>
-          <wp:inline distT="0" distB="0" distL="0" distR="0" wp14:anchorId="782D76F2" wp14:editId="03392CE9">
+          <wp:inline distT="0" distB="0" distL="0" distR="0" wp14:anchorId="0DE57864" wp14:editId="37483CB7">
             <wp:extent cx="5600700" cy="4348043"/>
             <wp:effectExtent l="0" t="0" r="0" b="0"/>
             <wp:docPr id="48" name="Picture" descr="Figura 4. Diagrama de clases del agente Edge y de la API. En azul, las clases ya implementadas."/>
@@ -7601,7 +7613,7 @@
         <w:pStyle w:val="Ttulo2"/>
       </w:pPr>
       <w:bookmarkStart w:id="36" w:name="secuencia-de-la-funcionalidad-principal"/>
-      <w:bookmarkStart w:id="37" w:name="_Toc243608466"/>
+      <w:bookmarkStart w:id="37" w:name="_Toc243611184"/>
       <w:bookmarkEnd w:id="34"/>
       <w:r>
         <w:lastRenderedPageBreak/>
@@ -7618,7 +7630,7 @@
           <w:noProof/>
         </w:rPr>
         <w:drawing>
-          <wp:inline distT="0" distB="0" distL="0" distR="0" wp14:anchorId="437C9806" wp14:editId="1DE0EC8F">
+          <wp:inline distT="0" distB="0" distL="0" distR="0" wp14:anchorId="694E0EA5" wp14:editId="7294CBCC">
             <wp:extent cx="5600700" cy="4348043"/>
             <wp:effectExtent l="0" t="0" r="0" b="0"/>
             <wp:docPr id="52" name="Picture" descr="Figura 5. Secuencia de detección y alerta (CU-02 y CU-04)."/>
@@ -7681,7 +7693,7 @@
         <w:pStyle w:val="Ttulo2"/>
       </w:pPr>
       <w:bookmarkStart w:id="38" w:name="componentes-1"/>
-      <w:bookmarkStart w:id="39" w:name="_Toc243608467"/>
+      <w:bookmarkStart w:id="39" w:name="_Toc243611185"/>
       <w:bookmarkEnd w:id="36"/>
       <w:r>
         <w:lastRenderedPageBreak/>
@@ -7698,7 +7710,7 @@
           <w:noProof/>
         </w:rPr>
         <w:drawing>
-          <wp:inline distT="0" distB="0" distL="0" distR="0" wp14:anchorId="58DFF447" wp14:editId="22AB28D4">
+          <wp:inline distT="0" distB="0" distL="0" distR="0" wp14:anchorId="515B349D" wp14:editId="32FE4D44">
             <wp:extent cx="5600700" cy="4348043"/>
             <wp:effectExtent l="0" t="0" r="0" b="0"/>
             <wp:docPr id="56" name="Picture" descr="Figura 6. Diagrama de componentes y sus interfaces."/>
@@ -7753,7 +7765,7 @@
         <w:pStyle w:val="Ttulo1"/>
       </w:pPr>
       <w:bookmarkStart w:id="40" w:name="protocolo-de-la-baliza"/>
-      <w:bookmarkStart w:id="41" w:name="_Toc243608468"/>
+      <w:bookmarkStart w:id="41" w:name="_Toc243611186"/>
       <w:bookmarkEnd w:id="32"/>
       <w:bookmarkEnd w:id="38"/>
       <w:r>
@@ -7783,7 +7795,7 @@
         <w:pStyle w:val="Ttulo2"/>
       </w:pPr>
       <w:bookmarkStart w:id="42" w:name="post-alert"/>
-      <w:bookmarkStart w:id="43" w:name="_Toc243608469"/>
+      <w:bookmarkStart w:id="43" w:name="_Toc243611187"/>
       <w:r>
         <w:t xml:space="preserve">6.1 </w:t>
       </w:r>
@@ -8156,7 +8168,7 @@
         <w:pStyle w:val="Ttulo2"/>
       </w:pPr>
       <w:bookmarkStart w:id="44" w:name="política-del-agente-y-heartbeat"/>
-      <w:bookmarkStart w:id="45" w:name="_Toc243608470"/>
+      <w:bookmarkStart w:id="45" w:name="_Toc243611188"/>
       <w:bookmarkEnd w:id="42"/>
       <w:r>
         <w:t xml:space="preserve">6.2 Política del agente y </w:t>
@@ -8471,7 +8483,7 @@
         <w:pStyle w:val="Ttulo1"/>
       </w:pPr>
       <w:bookmarkStart w:id="46" w:name="mockups-del-dashboard"/>
-      <w:bookmarkStart w:id="47" w:name="_Toc243608471"/>
+      <w:bookmarkStart w:id="47" w:name="_Toc243611189"/>
       <w:bookmarkEnd w:id="40"/>
       <w:bookmarkEnd w:id="44"/>
       <w:r>
@@ -8488,7 +8500,7 @@
           <w:noProof/>
         </w:rPr>
         <w:drawing>
-          <wp:inline distT="0" distB="0" distL="0" distR="0" wp14:anchorId="1B4A091C" wp14:editId="024C4494">
+          <wp:inline distT="0" distB="0" distL="0" distR="0" wp14:anchorId="60E70890" wp14:editId="1A405481">
             <wp:extent cx="5600700" cy="3889375"/>
             <wp:effectExtent l="0" t="0" r="0" b="0"/>
             <wp:docPr id="64" name="Picture" descr="Figura 7. Dashboard de monitoreo."/>
@@ -8548,7 +8560,7 @@
         </w:rPr>
         <w:lastRenderedPageBreak/>
         <w:drawing>
-          <wp:inline distT="0" distB="0" distL="0" distR="0" wp14:anchorId="42EF873B" wp14:editId="7A23B561">
+          <wp:inline distT="0" distB="0" distL="0" distR="0" wp14:anchorId="30F6AAB0" wp14:editId="01FEE2E8">
             <wp:extent cx="5600700" cy="3889375"/>
             <wp:effectExtent l="0" t="0" r="0" b="0"/>
             <wp:docPr id="67" name="Picture" descr="Figura 8. Detalle de incidente con evidencia difuminada, cambio de estado y trazabilidad de la alerta."/>
@@ -8608,7 +8620,7 @@
         </w:rPr>
         <w:lastRenderedPageBreak/>
         <w:drawing>
-          <wp:inline distT="0" distB="0" distL="0" distR="0" wp14:anchorId="46F23E01" wp14:editId="56417844">
+          <wp:inline distT="0" distB="0" distL="0" distR="0" wp14:anchorId="2A537DE7" wp14:editId="6011D36C">
             <wp:extent cx="5600700" cy="3889375"/>
             <wp:effectExtent l="0" t="0" r="0" b="0"/>
             <wp:docPr id="70" name="Picture" descr="Figura 9. Configuración de cámaras, zonas y balizas (solo administrador)."/>
@@ -8984,7 +8996,7 @@
         <w:pStyle w:val="Ttulo1"/>
       </w:pPr>
       <w:bookmarkStart w:id="48" w:name="trazabilidad-de-requisitos-a-componentes"/>
-      <w:bookmarkStart w:id="49" w:name="_Toc243608472"/>
+      <w:bookmarkStart w:id="49" w:name="_Toc243611190"/>
       <w:bookmarkEnd w:id="46"/>
       <w:r>
         <w:t>8. Trazabilidad de requisitos a componentes</w:t>
@@ -9681,7 +9693,7 @@
         <w:pStyle w:val="Ttulo1"/>
       </w:pPr>
       <w:bookmarkStart w:id="50" w:name="X002f11185e3d7a538a014018f6acf5597cbddd0"/>
-      <w:bookmarkStart w:id="51" w:name="_Toc243608473"/>
+      <w:bookmarkStart w:id="51" w:name="_Toc243611191"/>
       <w:bookmarkEnd w:id="48"/>
       <w:r>
         <w:t>9. Brechas con el código actual y pendientes</w:t>
@@ -10109,7 +10121,7 @@
         <w:pStyle w:val="Ttulo2"/>
       </w:pPr>
       <w:bookmarkStart w:id="52" w:name="Xd63c42e4765c71c3d67d2dba4bc34f7d18a54de"/>
-      <w:bookmarkStart w:id="53" w:name="_Toc243608474"/>
+      <w:bookmarkStart w:id="53" w:name="_Toc243611192"/>
       <w:r>
         <w:t xml:space="preserve">9.1 Cambios del código en </w:t>
       </w:r>
@@ -10576,7 +10588,7 @@
           <w:b/>
           <w:bCs/>
         </w:rPr>
-        <w:t>A confirmar en la reunión de aprobación:</w:t>
+        <w:t>Puntos abiertos que se resuelven durante la construcción:</w:t>
       </w:r>
     </w:p>
     <w:p>
@@ -10584,7 +10596,7 @@
         <w:pStyle w:val="Compact"/>
         <w:numPr>
           <w:ilvl w:val="0"/>
-          <w:numId w:val="45"/>
+          <w:numId w:val="49"/>
         </w:numPr>
       </w:pPr>
       <w:r>
@@ -10606,7 +10618,7 @@
         <w:pStyle w:val="Compact"/>
         <w:numPr>
           <w:ilvl w:val="0"/>
-          <w:numId w:val="45"/>
+          <w:numId w:val="49"/>
         </w:numPr>
       </w:pPr>
       <w:r>
@@ -10618,7 +10630,7 @@
         <w:pStyle w:val="Compact"/>
         <w:numPr>
           <w:ilvl w:val="0"/>
-          <w:numId w:val="45"/>
+          <w:numId w:val="49"/>
         </w:numPr>
       </w:pPr>
       <w:r>
@@ -10630,7 +10642,7 @@
         <w:pStyle w:val="Compact"/>
         <w:numPr>
           <w:ilvl w:val="0"/>
-          <w:numId w:val="45"/>
+          <w:numId w:val="49"/>
         </w:numPr>
       </w:pPr>
       <w:r>
@@ -10642,7 +10654,7 @@
         <w:pStyle w:val="Compact"/>
         <w:numPr>
           <w:ilvl w:val="0"/>
-          <w:numId w:val="45"/>
+          <w:numId w:val="49"/>
         </w:numPr>
       </w:pPr>
       <w:r>
@@ -10654,7 +10666,7 @@
         <w:pStyle w:val="Compact"/>
         <w:numPr>
           <w:ilvl w:val="0"/>
-          <w:numId w:val="45"/>
+          <w:numId w:val="49"/>
         </w:numPr>
       </w:pPr>
       <w:r>
@@ -10666,7 +10678,7 @@
         <w:pStyle w:val="Ttulo1"/>
       </w:pPr>
       <w:bookmarkStart w:id="54" w:name="aprobación"/>
-      <w:bookmarkStart w:id="55" w:name="_Toc243608475"/>
+      <w:bookmarkStart w:id="55" w:name="_Toc243611193"/>
       <w:bookmarkEnd w:id="50"/>
       <w:bookmarkEnd w:id="52"/>
       <w:r>
@@ -10682,10 +10694,10 @@
         <w:tblLook w:val="0020" w:firstRow="1" w:lastRow="0" w:firstColumn="0" w:lastColumn="0" w:noHBand="0" w:noVBand="0"/>
       </w:tblPr>
       <w:tblGrid>
-        <w:gridCol w:w="2241"/>
-        <w:gridCol w:w="4303"/>
-        <w:gridCol w:w="1524"/>
-        <w:gridCol w:w="986"/>
+        <w:gridCol w:w="2264"/>
+        <w:gridCol w:w="3712"/>
+        <w:gridCol w:w="1539"/>
+        <w:gridCol w:w="1539"/>
       </w:tblGrid>
       <w:tr>
         <w:trPr>
@@ -10694,7 +10706,7 @@
         </w:trPr>
         <w:tc>
           <w:tcPr>
-            <w:tcW w:w="1960" w:type="dxa"/>
+            <w:tcW w:w="1980" w:type="dxa"/>
           </w:tcPr>
           <w:p>
             <w:pPr>
@@ -10707,7 +10719,7 @@
         </w:tc>
         <w:tc>
           <w:tcPr>
-            <w:tcW w:w="3763" w:type="dxa"/>
+            <w:tcW w:w="3247" w:type="dxa"/>
           </w:tcPr>
           <w:p>
             <w:pPr>
@@ -10720,7 +10732,7 @@
         </w:tc>
         <w:tc>
           <w:tcPr>
-            <w:tcW w:w="1333" w:type="dxa"/>
+            <w:tcW w:w="1346" w:type="dxa"/>
           </w:tcPr>
           <w:p>
             <w:pPr>
@@ -10733,7 +10745,7 @@
         </w:tc>
         <w:tc>
           <w:tcPr>
-            <w:tcW w:w="862" w:type="dxa"/>
+            <w:tcW w:w="1346" w:type="dxa"/>
           </w:tcPr>
           <w:p>
             <w:pPr>
@@ -10748,7 +10760,7 @@
       <w:tr>
         <w:tc>
           <w:tcPr>
-            <w:tcW w:w="1960" w:type="dxa"/>
+            <w:tcW w:w="1980" w:type="dxa"/>
           </w:tcPr>
           <w:p>
             <w:pPr>
@@ -10761,7 +10773,7 @@
         </w:tc>
         <w:tc>
           <w:tcPr>
-            <w:tcW w:w="3763" w:type="dxa"/>
+            <w:tcW w:w="3247" w:type="dxa"/>
           </w:tcPr>
           <w:p>
             <w:pPr>
@@ -10774,32 +10786,35 @@
         </w:tc>
         <w:tc>
           <w:tcPr>
-            <w:tcW w:w="1333" w:type="dxa"/>
-          </w:tcPr>
-          <w:p>
-            <w:pPr>
-              <w:pStyle w:val="Compact"/>
-            </w:pPr>
-            <w:r>
-              <w:t>Pendiente</w:t>
-            </w:r>
-          </w:p>
-        </w:tc>
-        <w:tc>
-          <w:tcPr>
-            <w:tcW w:w="862" w:type="dxa"/>
-          </w:tcPr>
-          <w:p>
-            <w:pPr>
-              <w:pStyle w:val="Compact"/>
-            </w:pPr>
+            <w:tcW w:w="1346" w:type="dxa"/>
+          </w:tcPr>
+          <w:p>
+            <w:pPr>
+              <w:pStyle w:val="Compact"/>
+            </w:pPr>
+            <w:r>
+              <w:t>Aprobado</w:t>
+            </w:r>
+          </w:p>
+        </w:tc>
+        <w:tc>
+          <w:tcPr>
+            <w:tcW w:w="1346" w:type="dxa"/>
+          </w:tcPr>
+          <w:p>
+            <w:pPr>
+              <w:pStyle w:val="Compact"/>
+            </w:pPr>
+            <w:r>
+              <w:t>23-10-2026</w:t>
+            </w:r>
           </w:p>
         </w:tc>
       </w:tr>
       <w:tr>
         <w:tc>
           <w:tcPr>
-            <w:tcW w:w="1960" w:type="dxa"/>
+            <w:tcW w:w="1980" w:type="dxa"/>
           </w:tcPr>
           <w:p>
             <w:pPr>
@@ -10812,7 +10827,7 @@
         </w:tc>
         <w:tc>
           <w:tcPr>
-            <w:tcW w:w="3763" w:type="dxa"/>
+            <w:tcW w:w="3247" w:type="dxa"/>
           </w:tcPr>
           <w:p>
             <w:pPr>
@@ -10825,32 +10840,35 @@
         </w:tc>
         <w:tc>
           <w:tcPr>
-            <w:tcW w:w="1333" w:type="dxa"/>
-          </w:tcPr>
-          <w:p>
-            <w:pPr>
-              <w:pStyle w:val="Compact"/>
-            </w:pPr>
-            <w:r>
-              <w:t>Pendiente</w:t>
-            </w:r>
-          </w:p>
-        </w:tc>
-        <w:tc>
-          <w:tcPr>
-            <w:tcW w:w="862" w:type="dxa"/>
-          </w:tcPr>
-          <w:p>
-            <w:pPr>
-              <w:pStyle w:val="Compact"/>
-            </w:pPr>
+            <w:tcW w:w="1346" w:type="dxa"/>
+          </w:tcPr>
+          <w:p>
+            <w:pPr>
+              <w:pStyle w:val="Compact"/>
+            </w:pPr>
+            <w:r>
+              <w:t>Aprobado</w:t>
+            </w:r>
+          </w:p>
+        </w:tc>
+        <w:tc>
+          <w:tcPr>
+            <w:tcW w:w="1346" w:type="dxa"/>
+          </w:tcPr>
+          <w:p>
+            <w:pPr>
+              <w:pStyle w:val="Compact"/>
+            </w:pPr>
+            <w:r>
+              <w:t>23-10-2026</w:t>
+            </w:r>
           </w:p>
         </w:tc>
       </w:tr>
       <w:tr>
         <w:tc>
           <w:tcPr>
-            <w:tcW w:w="1960" w:type="dxa"/>
+            <w:tcW w:w="1980" w:type="dxa"/>
           </w:tcPr>
           <w:p>
             <w:pPr>
@@ -10863,7 +10881,7 @@
         </w:tc>
         <w:tc>
           <w:tcPr>
-            <w:tcW w:w="3763" w:type="dxa"/>
+            <w:tcW w:w="3247" w:type="dxa"/>
           </w:tcPr>
           <w:p>
             <w:pPr>
@@ -10876,32 +10894,35 @@
         </w:tc>
         <w:tc>
           <w:tcPr>
-            <w:tcW w:w="1333" w:type="dxa"/>
-          </w:tcPr>
-          <w:p>
-            <w:pPr>
-              <w:pStyle w:val="Compact"/>
-            </w:pPr>
-            <w:r>
-              <w:t>Pendiente</w:t>
-            </w:r>
-          </w:p>
-        </w:tc>
-        <w:tc>
-          <w:tcPr>
-            <w:tcW w:w="862" w:type="dxa"/>
-          </w:tcPr>
-          <w:p>
-            <w:pPr>
-              <w:pStyle w:val="Compact"/>
-            </w:pPr>
+            <w:tcW w:w="1346" w:type="dxa"/>
+          </w:tcPr>
+          <w:p>
+            <w:pPr>
+              <w:pStyle w:val="Compact"/>
+            </w:pPr>
+            <w:r>
+              <w:t>Aprobado</w:t>
+            </w:r>
+          </w:p>
+        </w:tc>
+        <w:tc>
+          <w:tcPr>
+            <w:tcW w:w="1346" w:type="dxa"/>
+          </w:tcPr>
+          <w:p>
+            <w:pPr>
+              <w:pStyle w:val="Compact"/>
+            </w:pPr>
+            <w:r>
+              <w:t>23-10-2026</w:t>
+            </w:r>
           </w:p>
         </w:tc>
       </w:tr>
       <w:tr>
         <w:tc>
           <w:tcPr>
-            <w:tcW w:w="1960" w:type="dxa"/>
+            <w:tcW w:w="1980" w:type="dxa"/>
           </w:tcPr>
           <w:p>
             <w:pPr>
@@ -10914,7 +10935,7 @@
         </w:tc>
         <w:tc>
           <w:tcPr>
-            <w:tcW w:w="3763" w:type="dxa"/>
+            <w:tcW w:w="3247" w:type="dxa"/>
           </w:tcPr>
           <w:p>
             <w:pPr>
@@ -10927,31 +10948,41 @@
         </w:tc>
         <w:tc>
           <w:tcPr>
-            <w:tcW w:w="1333" w:type="dxa"/>
-          </w:tcPr>
-          <w:p>
-            <w:pPr>
-              <w:pStyle w:val="Compact"/>
-            </w:pPr>
-            <w:r>
-              <w:t>Pendiente</w:t>
-            </w:r>
-          </w:p>
-        </w:tc>
-        <w:tc>
-          <w:tcPr>
-            <w:tcW w:w="862" w:type="dxa"/>
-          </w:tcPr>
-          <w:p>
-            <w:pPr>
-              <w:pStyle w:val="Compact"/>
-            </w:pPr>
+            <w:tcW w:w="1346" w:type="dxa"/>
+          </w:tcPr>
+          <w:p>
+            <w:pPr>
+              <w:pStyle w:val="Compact"/>
+            </w:pPr>
+            <w:r>
+              <w:t>Aprobado</w:t>
+            </w:r>
+          </w:p>
+        </w:tc>
+        <w:tc>
+          <w:tcPr>
+            <w:tcW w:w="1346" w:type="dxa"/>
+          </w:tcPr>
+          <w:p>
+            <w:pPr>
+              <w:pStyle w:val="Compact"/>
+            </w:pPr>
+            <w:r>
+              <w:t>23-10-2026</w:t>
+            </w:r>
           </w:p>
         </w:tc>
       </w:tr>
+    </w:tbl>
+    <w:p>
+      <w:pPr>
+        <w:pStyle w:val="Textoindependiente"/>
+      </w:pPr>
+      <w:r>
+        <w:t>Aprobación registrada por Iahn Vera (jefe de proyecto) el 23-10-2026.</w:t>
+      </w:r>
       <w:bookmarkEnd w:id="54"/>
-    </w:tbl>
-    <w:p/>
+    </w:p>
     <w:sectPr>
       <w:footnotePr>
         <w:numRestart w:val="eachSect"/>
@@ -11817,6 +11848,45 @@
     <w:abstractNumId w:val="1"/>
   </w:num>
   <w:num w:numId="45" w16cid:durableId="829638532">
+    <w:abstractNumId w:val="4"/>
+    <w:lvlOverride w:ilvl="0">
+      <w:startOverride w:val="1"/>
+    </w:lvlOverride>
+    <w:lvlOverride w:ilvl="1">
+      <w:startOverride w:val="1"/>
+    </w:lvlOverride>
+    <w:lvlOverride w:ilvl="2">
+      <w:startOverride w:val="1"/>
+    </w:lvlOverride>
+    <w:lvlOverride w:ilvl="3">
+      <w:startOverride w:val="1"/>
+    </w:lvlOverride>
+    <w:lvlOverride w:ilvl="4">
+      <w:startOverride w:val="1"/>
+    </w:lvlOverride>
+    <w:lvlOverride w:ilvl="5">
+      <w:startOverride w:val="1"/>
+    </w:lvlOverride>
+    <w:lvlOverride w:ilvl="6">
+      <w:startOverride w:val="1"/>
+    </w:lvlOverride>
+    <w:lvlOverride w:ilvl="7">
+      <w:startOverride w:val="1"/>
+    </w:lvlOverride>
+    <w:lvlOverride w:ilvl="8">
+      <w:startOverride w:val="1"/>
+    </w:lvlOverride>
+  </w:num>
+  <w:num w:numId="46" w16cid:durableId="1441101324">
+    <w:abstractNumId w:val="0"/>
+  </w:num>
+  <w:num w:numId="47" w16cid:durableId="1609507331">
+    <w:abstractNumId w:val="1"/>
+  </w:num>
+  <w:num w:numId="48" w16cid:durableId="522784907">
+    <w:abstractNumId w:val="1"/>
+  </w:num>
+  <w:num w:numId="49" w16cid:durableId="973025157">
     <w:abstractNumId w:val="4"/>
     <w:lvlOverride w:ilvl="0">
       <w:startOverride w:val="1"/>

</xml_diff>